<commit_message>
A general report on laboratory work has been issued
</commit_message>
<xml_diff>
--- a/Lab9.docx
+++ b/Lab9.docx
@@ -2,6 +2,524 @@
 <file path=word/document.xml><?xml version="1.0" encoding="utf-8"?>
 <w:document xmlns:wpc="http://schemas.microsoft.com/office/word/2010/wordprocessingCanvas" xmlns:cx="http://schemas.microsoft.com/office/drawing/2014/chartex" xmlns:cx1="http://schemas.microsoft.com/office/drawing/2015/9/8/chartex" xmlns:cx2="http://schemas.microsoft.com/office/drawing/2015/10/21/chartex" xmlns:cx3="http://schemas.microsoft.com/office/drawing/2016/5/9/chartex" xmlns:cx4="http://schemas.microsoft.com/office/drawing/2016/5/10/chartex" xmlns:cx5="http://schemas.microsoft.com/office/drawing/2016/5/11/chartex" xmlns:cx6="http://schemas.microsoft.com/office/drawing/2016/5/12/chartex" xmlns:cx7="http://schemas.microsoft.com/office/drawing/2016/5/13/chartex" xmlns:cx8="http://schemas.microsoft.com/office/drawing/2016/5/14/chartex" xmlns:mc="http://schemas.openxmlformats.org/markup-compatibility/2006" xmlns:aink="http://schemas.microsoft.com/office/drawing/2016/ink" xmlns:am3d="http://schemas.microsoft.com/office/drawing/2017/model3d" xmlns:o="urn:schemas-microsoft-com:office:office" xmlns:r="http://schemas.openxmlformats.org/officeDocument/2006/relationships" xmlns:m="http://schemas.openxmlformats.org/officeDocument/2006/math" xmlns:v="urn:schemas-microsoft-com:vml" xmlns:wp14="http://schemas.microsoft.com/office/word/2010/wordprocessingDrawing" xmlns:wp="http://schemas.openxmlformats.org/drawingml/2006/wordprocessingDrawing" xmlns:w10="urn:schemas-microsoft-com:office:word" xmlns:w="http://schemas.openxmlformats.org/wordprocessingml/2006/main" xmlns:w14="http://schemas.microsoft.com/office/word/2010/wordml" xmlns:w15="http://schemas.microsoft.com/office/word/2012/wordml" xmlns:w16cid="http://schemas.microsoft.com/office/word/2016/wordml/cid" xmlns:w16se="http://schemas.microsoft.com/office/word/2015/wordml/symex" xmlns:wpg="http://schemas.microsoft.com/office/word/2010/wordprocessingGroup" xmlns:wpi="http://schemas.microsoft.com/office/word/2010/wordprocessingInk" xmlns:wne="http://schemas.microsoft.com/office/word/2006/wordml" xmlns:wps="http://schemas.microsoft.com/office/word/2010/wordprocessingShape" mc:Ignorable="w14 w15 w16se w16cid wp14">
   <w:body>
+    <w:p>
+      <w:pPr>
+        <w:pStyle w:val="docdata"/>
+        <w:spacing w:before="0" w:beforeAutospacing="0" w:after="200" w:afterAutospacing="0"/>
+        <w:jc w:val="center"/>
+        <w:rPr>
+          <w:sz w:val="28"/>
+          <w:szCs w:val="28"/>
+        </w:rPr>
+      </w:pPr>
+      <w:r>
+        <w:rPr>
+          <w:color w:val="000000"/>
+          <w:sz w:val="28"/>
+          <w:szCs w:val="28"/>
+        </w:rPr>
+        <w:t>Министерство науки и высшего образования РФ</w:t>
+      </w:r>
+    </w:p>
+    <w:p>
+      <w:pPr>
+        <w:pStyle w:val="a6"/>
+        <w:spacing w:before="0" w:beforeAutospacing="0" w:after="200" w:afterAutospacing="0"/>
+        <w:jc w:val="center"/>
+        <w:rPr>
+          <w:sz w:val="28"/>
+          <w:szCs w:val="28"/>
+        </w:rPr>
+      </w:pPr>
+      <w:r>
+        <w:rPr>
+          <w:color w:val="000000"/>
+          <w:sz w:val="28"/>
+          <w:szCs w:val="28"/>
+        </w:rPr>
+        <w:t>Пензенский государственный университет</w:t>
+      </w:r>
+    </w:p>
+    <w:p>
+      <w:pPr>
+        <w:pStyle w:val="a6"/>
+        <w:spacing w:before="0" w:beforeAutospacing="0" w:after="200" w:afterAutospacing="0"/>
+        <w:jc w:val="center"/>
+        <w:rPr>
+          <w:sz w:val="28"/>
+          <w:szCs w:val="28"/>
+        </w:rPr>
+      </w:pPr>
+      <w:r>
+        <w:rPr>
+          <w:color w:val="000000"/>
+          <w:sz w:val="28"/>
+          <w:szCs w:val="28"/>
+        </w:rPr>
+        <w:t>Кафедра «Вычислительная техника»</w:t>
+      </w:r>
+    </w:p>
+    <w:p>
+      <w:pPr>
+        <w:pStyle w:val="a6"/>
+        <w:spacing w:before="0" w:beforeAutospacing="0" w:after="200" w:afterAutospacing="0"/>
+        <w:jc w:val="center"/>
+        <w:rPr>
+          <w:sz w:val="28"/>
+          <w:szCs w:val="28"/>
+        </w:rPr>
+      </w:pPr>
+      <w:bookmarkStart w:id="0" w:name="_GoBack"/>
+      <w:bookmarkEnd w:id="0"/>
+    </w:p>
+    <w:p>
+      <w:pPr>
+        <w:pStyle w:val="a6"/>
+        <w:spacing w:before="2000" w:beforeAutospacing="0" w:after="200" w:afterAutospacing="0"/>
+        <w:jc w:val="center"/>
+        <w:rPr>
+          <w:sz w:val="28"/>
+          <w:szCs w:val="28"/>
+        </w:rPr>
+      </w:pPr>
+      <w:r>
+        <w:rPr>
+          <w:color w:val="000000"/>
+          <w:sz w:val="28"/>
+          <w:szCs w:val="28"/>
+        </w:rPr>
+        <w:t>ОТЧЁТ</w:t>
+      </w:r>
+    </w:p>
+    <w:p>
+      <w:pPr>
+        <w:pStyle w:val="a6"/>
+        <w:spacing w:before="0" w:beforeAutospacing="0" w:after="200" w:afterAutospacing="0"/>
+        <w:jc w:val="center"/>
+        <w:rPr>
+          <w:sz w:val="28"/>
+          <w:szCs w:val="28"/>
+        </w:rPr>
+      </w:pPr>
+      <w:r>
+        <w:rPr>
+          <w:color w:val="000000"/>
+          <w:sz w:val="28"/>
+          <w:szCs w:val="28"/>
+        </w:rPr>
+        <w:t>по лабораторной работе №</w:t>
+      </w:r>
+      <w:r>
+        <w:rPr>
+          <w:color w:val="000000"/>
+          <w:sz w:val="28"/>
+          <w:szCs w:val="28"/>
+        </w:rPr>
+        <w:t>9</w:t>
+      </w:r>
+    </w:p>
+    <w:p>
+      <w:pPr>
+        <w:pStyle w:val="a6"/>
+        <w:spacing w:before="0" w:beforeAutospacing="0" w:after="200" w:afterAutospacing="0"/>
+        <w:jc w:val="center"/>
+        <w:rPr>
+          <w:sz w:val="28"/>
+          <w:szCs w:val="28"/>
+        </w:rPr>
+      </w:pPr>
+      <w:r>
+        <w:rPr>
+          <w:color w:val="000000"/>
+          <w:sz w:val="28"/>
+          <w:szCs w:val="28"/>
+        </w:rPr>
+        <w:t>По дисциплине «Информационные технологии в профессиональной деятельности»</w:t>
+      </w:r>
+    </w:p>
+    <w:p>
+      <w:pPr>
+        <w:pStyle w:val="a6"/>
+        <w:spacing w:before="0" w:beforeAutospacing="0" w:after="200" w:afterAutospacing="0"/>
+        <w:jc w:val="center"/>
+        <w:rPr>
+          <w:sz w:val="28"/>
+          <w:szCs w:val="28"/>
+        </w:rPr>
+      </w:pPr>
+      <w:r>
+        <w:rPr>
+          <w:color w:val="000000"/>
+          <w:sz w:val="28"/>
+          <w:szCs w:val="28"/>
+        </w:rPr>
+        <w:t>На тему: «</w:t>
+      </w:r>
+      <w:r>
+        <w:rPr>
+          <w:color w:val="000000"/>
+          <w:sz w:val="28"/>
+          <w:szCs w:val="28"/>
+        </w:rPr>
+        <w:t>«</w:t>
+      </w:r>
+      <w:proofErr w:type="spellStart"/>
+      <w:r>
+        <w:rPr>
+          <w:color w:val="000000"/>
+          <w:sz w:val="28"/>
+          <w:szCs w:val="28"/>
+        </w:rPr>
+        <w:t>GitHub</w:t>
+      </w:r>
+      <w:proofErr w:type="spellEnd"/>
+      <w:r>
+        <w:rPr>
+          <w:color w:val="000000"/>
+          <w:sz w:val="28"/>
+          <w:szCs w:val="28"/>
+        </w:rPr>
+        <w:t>. Совместная работа»</w:t>
+      </w:r>
+      <w:r>
+        <w:rPr>
+          <w:color w:val="000000"/>
+          <w:sz w:val="28"/>
+          <w:szCs w:val="28"/>
+        </w:rPr>
+        <w:t>»</w:t>
+      </w:r>
+    </w:p>
+    <w:p>
+      <w:pPr>
+        <w:pStyle w:val="a6"/>
+        <w:spacing w:before="0" w:beforeAutospacing="0" w:after="200" w:afterAutospacing="0"/>
+        <w:ind w:left="3969"/>
+        <w:rPr>
+          <w:sz w:val="28"/>
+          <w:szCs w:val="28"/>
+        </w:rPr>
+      </w:pPr>
+      <w:r>
+        <w:rPr>
+          <w:sz w:val="28"/>
+          <w:szCs w:val="28"/>
+        </w:rPr>
+        <w:t> </w:t>
+      </w:r>
+    </w:p>
+    <w:p>
+      <w:pPr>
+        <w:pStyle w:val="a6"/>
+        <w:spacing w:before="0" w:beforeAutospacing="0" w:after="200" w:afterAutospacing="0"/>
+        <w:ind w:left="3969"/>
+        <w:rPr>
+          <w:sz w:val="28"/>
+          <w:szCs w:val="28"/>
+        </w:rPr>
+      </w:pPr>
+      <w:r>
+        <w:rPr>
+          <w:sz w:val="28"/>
+          <w:szCs w:val="28"/>
+        </w:rPr>
+        <w:t> </w:t>
+      </w:r>
+    </w:p>
+    <w:p>
+      <w:pPr>
+        <w:pStyle w:val="a6"/>
+        <w:spacing w:before="0" w:beforeAutospacing="0" w:after="200" w:afterAutospacing="0"/>
+        <w:ind w:left="3969"/>
+        <w:rPr>
+          <w:sz w:val="28"/>
+          <w:szCs w:val="28"/>
+        </w:rPr>
+      </w:pPr>
+      <w:r>
+        <w:rPr>
+          <w:color w:val="000000"/>
+          <w:sz w:val="28"/>
+          <w:szCs w:val="28"/>
+        </w:rPr>
+        <w:t> </w:t>
+      </w:r>
+    </w:p>
+    <w:p>
+      <w:pPr>
+        <w:pStyle w:val="a6"/>
+        <w:spacing w:before="0" w:beforeAutospacing="0" w:after="200" w:afterAutospacing="0"/>
+        <w:ind w:left="3969"/>
+        <w:rPr>
+          <w:sz w:val="28"/>
+          <w:szCs w:val="28"/>
+        </w:rPr>
+      </w:pPr>
+      <w:r>
+        <w:rPr>
+          <w:color w:val="000000"/>
+          <w:sz w:val="28"/>
+          <w:szCs w:val="28"/>
+        </w:rPr>
+        <w:t> </w:t>
+      </w:r>
+    </w:p>
+    <w:p>
+      <w:pPr>
+        <w:pStyle w:val="a6"/>
+        <w:spacing w:before="0" w:beforeAutospacing="0" w:after="200" w:afterAutospacing="0"/>
+        <w:ind w:left="3969"/>
+        <w:rPr>
+          <w:sz w:val="28"/>
+          <w:szCs w:val="28"/>
+        </w:rPr>
+      </w:pPr>
+      <w:r>
+        <w:rPr>
+          <w:sz w:val="28"/>
+          <w:szCs w:val="28"/>
+        </w:rPr>
+        <w:t> </w:t>
+      </w:r>
+    </w:p>
+    <w:p>
+      <w:pPr>
+        <w:pStyle w:val="a6"/>
+        <w:spacing w:before="0" w:beforeAutospacing="0" w:after="200" w:afterAutospacing="0"/>
+        <w:ind w:left="3969"/>
+        <w:rPr>
+          <w:sz w:val="28"/>
+          <w:szCs w:val="28"/>
+        </w:rPr>
+      </w:pPr>
+      <w:r>
+        <w:rPr>
+          <w:color w:val="000000"/>
+          <w:sz w:val="28"/>
+          <w:szCs w:val="28"/>
+        </w:rPr>
+        <w:t>Выполнил: ст. гр. 25ВВВ1</w:t>
+      </w:r>
+    </w:p>
+    <w:p>
+      <w:pPr>
+        <w:pStyle w:val="a6"/>
+        <w:spacing w:before="0" w:beforeAutospacing="0" w:after="200" w:afterAutospacing="0"/>
+        <w:ind w:left="4535"/>
+        <w:rPr>
+          <w:sz w:val="28"/>
+          <w:szCs w:val="28"/>
+        </w:rPr>
+      </w:pPr>
+      <w:r>
+        <w:rPr>
+          <w:color w:val="000000"/>
+          <w:sz w:val="28"/>
+          <w:szCs w:val="28"/>
+        </w:rPr>
+        <w:t>Аверин А. А.</w:t>
+      </w:r>
+    </w:p>
+    <w:p>
+      <w:pPr>
+        <w:pStyle w:val="a6"/>
+        <w:spacing w:before="0" w:beforeAutospacing="0" w:after="200" w:afterAutospacing="0"/>
+        <w:ind w:left="4535"/>
+        <w:rPr>
+          <w:color w:val="000000"/>
+          <w:sz w:val="28"/>
+          <w:szCs w:val="28"/>
+        </w:rPr>
+      </w:pPr>
+      <w:r>
+        <w:rPr>
+          <w:color w:val="000000"/>
+          <w:sz w:val="28"/>
+          <w:szCs w:val="28"/>
+        </w:rPr>
+        <w:t>Ячменёв М. А.</w:t>
+      </w:r>
+    </w:p>
+    <w:p>
+      <w:pPr>
+        <w:pStyle w:val="a6"/>
+        <w:spacing w:before="0" w:beforeAutospacing="0" w:after="200" w:afterAutospacing="0"/>
+        <w:ind w:left="4535"/>
+        <w:rPr>
+          <w:sz w:val="28"/>
+          <w:szCs w:val="28"/>
+        </w:rPr>
+      </w:pPr>
+      <w:proofErr w:type="spellStart"/>
+      <w:r>
+        <w:rPr>
+          <w:sz w:val="28"/>
+          <w:szCs w:val="28"/>
+        </w:rPr>
+        <w:t>Какулин</w:t>
+      </w:r>
+      <w:proofErr w:type="spellEnd"/>
+      <w:r>
+        <w:rPr>
+          <w:sz w:val="28"/>
+          <w:szCs w:val="28"/>
+        </w:rPr>
+        <w:t xml:space="preserve"> В.С.</w:t>
+      </w:r>
+    </w:p>
+    <w:p>
+      <w:pPr>
+        <w:pStyle w:val="a6"/>
+        <w:spacing w:before="0" w:beforeAutospacing="0" w:after="200" w:afterAutospacing="0"/>
+        <w:ind w:left="4535"/>
+        <w:rPr>
+          <w:sz w:val="28"/>
+          <w:szCs w:val="28"/>
+        </w:rPr>
+      </w:pPr>
+      <w:r>
+        <w:rPr>
+          <w:sz w:val="28"/>
+          <w:szCs w:val="28"/>
+        </w:rPr>
+        <w:t>Самсонов М.А.</w:t>
+      </w:r>
+    </w:p>
+    <w:p>
+      <w:pPr>
+        <w:pStyle w:val="a6"/>
+        <w:tabs>
+          <w:tab w:val="left" w:pos="6672"/>
+          <w:tab w:val="left" w:pos="6794"/>
+        </w:tabs>
+        <w:spacing w:before="0" w:beforeAutospacing="0" w:after="200" w:afterAutospacing="0"/>
+        <w:ind w:left="3969"/>
+        <w:rPr>
+          <w:sz w:val="28"/>
+          <w:szCs w:val="28"/>
+        </w:rPr>
+      </w:pPr>
+      <w:r>
+        <w:rPr>
+          <w:color w:val="000000"/>
+          <w:sz w:val="28"/>
+          <w:szCs w:val="28"/>
+        </w:rPr>
+        <w:t>Приняли:</w:t>
+      </w:r>
+    </w:p>
+    <w:p>
+      <w:pPr>
+        <w:pStyle w:val="a6"/>
+        <w:tabs>
+          <w:tab w:val="left" w:pos="6672"/>
+          <w:tab w:val="left" w:pos="6794"/>
+        </w:tabs>
+        <w:spacing w:before="0" w:beforeAutospacing="0" w:after="200" w:afterAutospacing="0"/>
+        <w:ind w:left="4535"/>
+        <w:rPr>
+          <w:sz w:val="28"/>
+          <w:szCs w:val="28"/>
+        </w:rPr>
+      </w:pPr>
+      <w:r>
+        <w:rPr>
+          <w:color w:val="000000"/>
+          <w:sz w:val="28"/>
+          <w:szCs w:val="28"/>
+        </w:rPr>
+        <w:t>к.т.н., доцент Юрова О. В.</w:t>
+      </w:r>
+    </w:p>
+    <w:p>
+      <w:pPr>
+        <w:pStyle w:val="a6"/>
+        <w:spacing w:before="0" w:beforeAutospacing="0" w:after="200" w:afterAutospacing="0"/>
+        <w:ind w:left="4535"/>
+        <w:rPr>
+          <w:sz w:val="28"/>
+          <w:szCs w:val="28"/>
+        </w:rPr>
+      </w:pPr>
+      <w:r>
+        <w:rPr>
+          <w:color w:val="000000"/>
+          <w:sz w:val="28"/>
+          <w:szCs w:val="28"/>
+        </w:rPr>
+        <w:t>к.т.н., доцент Митрохина Н.Ю.</w:t>
+      </w:r>
+    </w:p>
+    <w:p>
+      <w:pPr>
+        <w:pStyle w:val="a6"/>
+        <w:spacing w:before="0" w:beforeAutospacing="0" w:after="160" w:afterAutospacing="0"/>
+        <w:rPr>
+          <w:sz w:val="28"/>
+          <w:szCs w:val="28"/>
+        </w:rPr>
+      </w:pPr>
+      <w:r>
+        <w:rPr>
+          <w:sz w:val="28"/>
+          <w:szCs w:val="28"/>
+        </w:rPr>
+        <w:t> </w:t>
+      </w:r>
+    </w:p>
+    <w:p>
+      <w:pPr>
+        <w:pStyle w:val="a6"/>
+        <w:spacing w:before="0" w:beforeAutospacing="0" w:after="160" w:afterAutospacing="0"/>
+        <w:rPr>
+          <w:sz w:val="28"/>
+          <w:szCs w:val="28"/>
+        </w:rPr>
+      </w:pPr>
+      <w:r>
+        <w:rPr>
+          <w:sz w:val="28"/>
+          <w:szCs w:val="28"/>
+        </w:rPr>
+        <w:t> </w:t>
+      </w:r>
+    </w:p>
+    <w:p>
+      <w:pPr>
+        <w:pStyle w:val="a6"/>
+        <w:spacing w:before="0" w:beforeAutospacing="0" w:after="160" w:afterAutospacing="0"/>
+        <w:rPr>
+          <w:sz w:val="28"/>
+          <w:szCs w:val="28"/>
+        </w:rPr>
+      </w:pPr>
+      <w:r>
+        <w:rPr>
+          <w:sz w:val="28"/>
+          <w:szCs w:val="28"/>
+        </w:rPr>
+        <w:t xml:space="preserve">                                                     </w:t>
+      </w:r>
+      <w:r>
+        <w:rPr>
+          <w:color w:val="000000"/>
+          <w:sz w:val="28"/>
+          <w:szCs w:val="28"/>
+        </w:rPr>
+        <w:t>Пенза 2026</w:t>
+      </w:r>
+    </w:p>
+    <w:p>
+      <w:pPr>
+        <w:rPr>
+          <w:rFonts w:ascii="Times New Roman" w:hAnsi="Times New Roman" w:cs="Times New Roman"/>
+          <w:b/>
+          <w:bCs/>
+          <w:sz w:val="28"/>
+          <w:szCs w:val="24"/>
+        </w:rPr>
+      </w:pPr>
+    </w:p>
     <w:p>
       <w:pPr>
         <w:rPr>
@@ -830,7 +1348,6 @@
           <w:sz w:val="28"/>
           <w:szCs w:val="24"/>
         </w:rPr>
-        <w:lastRenderedPageBreak/>
         <w:t>3. Этап 1. Подготовительный (создание и наполнение репозитория)</w:t>
       </w:r>
     </w:p>
@@ -1631,7 +2148,6 @@
           <w:sz w:val="24"/>
           <w:szCs w:val="24"/>
         </w:rPr>
-        <w:lastRenderedPageBreak/>
         <w:t>4.1.2. Создание и переключение на новую ветку</w:t>
       </w:r>
     </w:p>
@@ -2107,7 +2623,6 @@
           <w:szCs w:val="24"/>
           <w:lang w:val="en-US"/>
         </w:rPr>
-        <w:lastRenderedPageBreak/>
         <w:t xml:space="preserve">4.1.6. </w:t>
       </w:r>
       <w:proofErr w:type="spellStart"/>
@@ -2405,6 +2920,7 @@
           <w:sz w:val="24"/>
           <w:szCs w:val="24"/>
         </w:rPr>
+        <w:lastRenderedPageBreak/>
         <w:t>4.</w:t>
       </w:r>
       <w:r>
@@ -2430,7 +2946,6 @@
           <w:sz w:val="24"/>
           <w:szCs w:val="24"/>
         </w:rPr>
-        <w:lastRenderedPageBreak/>
         <w:t>После приглашения я скопировал общий репозиторий к себе на компьютер.</w:t>
       </w:r>
     </w:p>
@@ -3085,6 +3600,7 @@
           <w:sz w:val="24"/>
           <w:szCs w:val="24"/>
         </w:rPr>
+        <w:lastRenderedPageBreak/>
         <w:t>После внесения изменений я зафиксировал их с осмысленным сообщением:</w:t>
       </w:r>
     </w:p>
@@ -3104,7 +3620,6 @@
           <w:szCs w:val="24"/>
           <w:lang w:val="en-US"/>
         </w:rPr>
-        <w:lastRenderedPageBreak/>
         <w:t xml:space="preserve">git </w:t>
       </w:r>
       <w:proofErr w:type="gramStart"/>
@@ -3621,6 +4136,7 @@
           <w:szCs w:val="24"/>
           <w:lang w:val="en-US"/>
         </w:rPr>
+        <w:lastRenderedPageBreak/>
         <w:t>git checkout master</w:t>
       </w:r>
     </w:p>
@@ -3640,7 +4156,6 @@
           <w:szCs w:val="24"/>
           <w:lang w:val="en-US"/>
         </w:rPr>
-        <w:lastRenderedPageBreak/>
         <w:t>git pull origin master</w:t>
       </w:r>
     </w:p>
@@ -4049,6 +4564,7 @@
           <w:sz w:val="24"/>
           <w:szCs w:val="24"/>
         </w:rPr>
+        <w:lastRenderedPageBreak/>
         <w:t>Мой отчёт 2</w:t>
       </w:r>
       <w:r>
@@ -4105,7 +4621,6 @@
           <w:sz w:val="24"/>
           <w:szCs w:val="24"/>
         </w:rPr>
-        <w:lastRenderedPageBreak/>
         <w:t>Все изменения прошли проверку координатором и успешно слиты с главной веткой.</w:t>
       </w:r>
     </w:p>
@@ -4441,6 +4956,7 @@
           <w:sz w:val="24"/>
           <w:szCs w:val="24"/>
         </w:rPr>
+        <w:lastRenderedPageBreak/>
         <w:drawing>
           <wp:inline distT="0" distB="0" distL="0" distR="0" wp14:anchorId="0CADC8F0" wp14:editId="02026241">
             <wp:extent cx="5314950" cy="3467100"/>
@@ -4505,7 +5021,6 @@
           <w:sz w:val="24"/>
           <w:szCs w:val="24"/>
         </w:rPr>
-        <w:lastRenderedPageBreak/>
         <w:t>4</w:t>
       </w:r>
       <w:r>
@@ -5184,6 +5699,7 @@
           <w:szCs w:val="24"/>
           <w:lang w:val="en-US"/>
         </w:rPr>
+        <w:lastRenderedPageBreak/>
         <w:t xml:space="preserve">void </w:t>
       </w:r>
       <w:proofErr w:type="spellStart"/>
@@ -7168,6 +7684,7 @@
           <w:sz w:val="24"/>
           <w:szCs w:val="24"/>
         </w:rPr>
+        <w:lastRenderedPageBreak/>
         <w:t xml:space="preserve">        }</w:t>
       </w:r>
     </w:p>
@@ -7703,7 +8220,6 @@
           <w:sz w:val="24"/>
           <w:szCs w:val="24"/>
         </w:rPr>
-        <w:lastRenderedPageBreak/>
         <w:t>После внесения изменений я зафиксировал их с осмысленным сообщением:</w:t>
       </w:r>
     </w:p>
@@ -8219,6 +8735,7 @@
           <w:szCs w:val="24"/>
           <w:lang w:val="en-US"/>
         </w:rPr>
+        <w:lastRenderedPageBreak/>
         <w:drawing>
           <wp:inline distT="0" distB="0" distL="0" distR="0" wp14:anchorId="16CF056C" wp14:editId="1F0FC3F9">
             <wp:extent cx="3467100" cy="733425"/>
@@ -8632,7 +9149,6 @@
           <w:sz w:val="24"/>
           <w:szCs w:val="24"/>
         </w:rPr>
-        <w:lastRenderedPageBreak/>
         <w:t>4.3.9</w:t>
       </w:r>
       <w:r>
@@ -8777,6 +9293,7 @@
           <w:sz w:val="24"/>
           <w:szCs w:val="24"/>
         </w:rPr>
+        <w:lastRenderedPageBreak/>
         <w:drawing>
           <wp:inline distT="0" distB="0" distL="0" distR="0" wp14:anchorId="2893EA28" wp14:editId="4D8ACF6E">
             <wp:extent cx="4419600" cy="3808632"/>
@@ -9147,7 +9664,6 @@
           <w:sz w:val="24"/>
           <w:szCs w:val="24"/>
         </w:rPr>
-        <w:lastRenderedPageBreak/>
         <w:t xml:space="preserve">[Скриншот: процесс слияния и </w:t>
       </w:r>
       <w:r>
@@ -9333,6 +9849,7 @@
           <w:sz w:val="24"/>
           <w:szCs w:val="24"/>
         </w:rPr>
+        <w:lastRenderedPageBreak/>
         <w:t>Мой отчёт 3.docx с описанием действий и скриншотами сохранён в репозитории.</w:t>
       </w:r>
     </w:p>
@@ -9629,37 +10146,37 @@
           <w:sz w:val="24"/>
           <w:szCs w:val="24"/>
         </w:rPr>
+        <w:t xml:space="preserve">5.1.3. Просмотр истории </w:t>
+      </w:r>
+      <w:proofErr w:type="spellStart"/>
+      <w:r>
+        <w:rPr>
+          <w:rFonts w:ascii="Times New Roman" w:hAnsi="Times New Roman" w:cs="Times New Roman"/>
+          <w:b/>
+          <w:bCs/>
+          <w:sz w:val="24"/>
+          <w:szCs w:val="24"/>
+        </w:rPr>
+        <w:t>коммитов</w:t>
+      </w:r>
+      <w:proofErr w:type="spellEnd"/>
+    </w:p>
+    <w:p>
+      <w:pPr>
+        <w:rPr>
+          <w:rFonts w:ascii="Times New Roman" w:hAnsi="Times New Roman" w:cs="Times New Roman"/>
+          <w:sz w:val="24"/>
+          <w:szCs w:val="24"/>
+        </w:rPr>
+      </w:pPr>
+      <w:r>
+        <w:rPr>
+          <w:rFonts w:ascii="Times New Roman" w:hAnsi="Times New Roman" w:cs="Times New Roman"/>
+          <w:noProof/>
+          <w:sz w:val="24"/>
+          <w:szCs w:val="24"/>
+        </w:rPr>
         <w:lastRenderedPageBreak/>
-        <w:t xml:space="preserve">5.1.3. Просмотр истории </w:t>
-      </w:r>
-      <w:proofErr w:type="spellStart"/>
-      <w:r>
-        <w:rPr>
-          <w:rFonts w:ascii="Times New Roman" w:hAnsi="Times New Roman" w:cs="Times New Roman"/>
-          <w:b/>
-          <w:bCs/>
-          <w:sz w:val="24"/>
-          <w:szCs w:val="24"/>
-        </w:rPr>
-        <w:t>коммитов</w:t>
-      </w:r>
-      <w:proofErr w:type="spellEnd"/>
-    </w:p>
-    <w:p>
-      <w:pPr>
-        <w:rPr>
-          <w:rFonts w:ascii="Times New Roman" w:hAnsi="Times New Roman" w:cs="Times New Roman"/>
-          <w:sz w:val="24"/>
-          <w:szCs w:val="24"/>
-        </w:rPr>
-      </w:pPr>
-      <w:r>
-        <w:rPr>
-          <w:rFonts w:ascii="Times New Roman" w:hAnsi="Times New Roman" w:cs="Times New Roman"/>
-          <w:noProof/>
-          <w:sz w:val="24"/>
-          <w:szCs w:val="24"/>
-        </w:rPr>
         <w:drawing>
           <wp:inline distT="0" distB="0" distL="0" distR="0" wp14:anchorId="1F3B95B8" wp14:editId="79BE440D">
             <wp:extent cx="5940425" cy="3227070"/>
@@ -10077,8 +10594,6 @@
         </w:rPr>
         <w:t xml:space="preserve"> </w:t>
       </w:r>
-      <w:bookmarkStart w:id="0" w:name="_GoBack"/>
-      <w:bookmarkEnd w:id="0"/>
     </w:p>
     <w:p>
       <w:pPr>
@@ -10202,7 +10717,6 @@
           <w:sz w:val="24"/>
           <w:szCs w:val="24"/>
         </w:rPr>
-        <w:lastRenderedPageBreak/>
         <w:t>Оформление отчётности</w:t>
       </w:r>
       <w:r>
@@ -10252,6 +10766,7 @@
           <w:sz w:val="24"/>
           <w:szCs w:val="24"/>
         </w:rPr>
+        <w:lastRenderedPageBreak/>
         <w:t>Совместная работа</w:t>
       </w:r>
       <w:r>
@@ -11966,6 +12481,7 @@
   <w:style w:type="character" w:default="1" w:styleId="a0">
     <w:name w:val="Default Paragraph Font"/>
     <w:uiPriority w:val="1"/>
+    <w:semiHidden/>
     <w:unhideWhenUsed/>
   </w:style>
   <w:style w:type="table" w:default="1" w:styleId="a1">
@@ -12064,6 +12580,37 @@
       <w:i/>
       <w:iCs/>
       <w:color w:val="2F5496" w:themeColor="accent1" w:themeShade="BF"/>
+    </w:rPr>
+  </w:style>
+  <w:style w:type="paragraph" w:customStyle="1" w:styleId="docdata">
+    <w:name w:val="docdata"/>
+    <w:aliases w:val="docy,v5,6257,bqiaagaaeyqcaaagiaiaaanfewaabw0taaaaaaaaaaaaaaaaaaaaaaaaaaaaaaaaaaaaaaaaaaaaaaaaaaaaaaaaaaaaaaaaaaaaaaaaaaaaaaaaaaaaaaaaaaaaaaaaaaaaaaaaaaaaaaaaaaaaaaaaaaaaaaaaaaaaaaaaaaaaaaaaaaaaaaaaaaaaaaaaaaaaaaaaaaaaaaaaaaaaaaaaaaaaaaaaaaaaaaaa"/>
+    <w:basedOn w:val="a"/>
+    <w:rsid w:val="00F035AA"/>
+    <w:pPr>
+      <w:spacing w:before="100" w:beforeAutospacing="1" w:after="100" w:afterAutospacing="1" w:line="240" w:lineRule="auto"/>
+    </w:pPr>
+    <w:rPr>
+      <w:rFonts w:ascii="Times New Roman" w:eastAsia="Times New Roman" w:hAnsi="Times New Roman" w:cs="Times New Roman"/>
+      <w:sz w:val="24"/>
+      <w:szCs w:val="24"/>
+      <w:lang w:eastAsia="ru-RU"/>
+    </w:rPr>
+  </w:style>
+  <w:style w:type="paragraph" w:styleId="a6">
+    <w:name w:val="Normal (Web)"/>
+    <w:basedOn w:val="a"/>
+    <w:uiPriority w:val="99"/>
+    <w:unhideWhenUsed/>
+    <w:rsid w:val="00F035AA"/>
+    <w:pPr>
+      <w:spacing w:before="100" w:beforeAutospacing="1" w:after="100" w:afterAutospacing="1" w:line="240" w:lineRule="auto"/>
+    </w:pPr>
+    <w:rPr>
+      <w:rFonts w:ascii="Times New Roman" w:eastAsia="Times New Roman" w:hAnsi="Times New Roman" w:cs="Times New Roman"/>
+      <w:sz w:val="24"/>
+      <w:szCs w:val="24"/>
+      <w:lang w:eastAsia="ru-RU"/>
     </w:rPr>
   </w:style>
 </w:styles>

</xml_diff>